<commit_message>
work on assignment 3
</commit_message>
<xml_diff>
--- a/Assignment 3/Client-Email_2.docx
+++ b/Assignment 3/Client-Email_2.docx
@@ -1787,9 +1787,8 @@
           <w:color w:val="FF0000"/>
           <w:lang w:val="en-AU"/>
         </w:rPr>
-        <w:t xml:space="preserve">, </w:t>
-      </w:r>
-      <w:proofErr w:type="spellStart"/>
+        <w:t>, P</w:t>
+      </w:r>
       <w:r>
         <w:rPr>
           <w:rFonts w:ascii="Calibri Light"/>
@@ -1798,9 +1797,8 @@
           <w:color w:val="FF0000"/>
           <w:lang w:val="en-AU"/>
         </w:rPr>
-        <w:t>Pediatric</w:t>
-      </w:r>
-      <w:proofErr w:type="spellEnd"/>
+        <w:t>a</w:t>
+      </w:r>
       <w:r>
         <w:rPr>
           <w:rFonts w:ascii="Calibri Light"/>
@@ -1809,7 +1807,7 @@
           <w:color w:val="FF0000"/>
           <w:lang w:val="en-AU"/>
         </w:rPr>
-        <w:t xml:space="preserve"> Optometrist)</w:t>
+        <w:t>ediatric Optometrist)</w:t>
       </w:r>
       <w:r>
         <w:rPr>
@@ -1900,20 +1898,7 @@
           <w:color w:val="FF0000"/>
         </w:rPr>
         <w:noBreakHyphen/>
-      </w:r>
-      <w:proofErr w:type="spellStart"/>
-      <w:r>
-        <w:rPr>
-          <w:color w:val="FF0000"/>
-        </w:rPr>
-        <w:t>centred</w:t>
-      </w:r>
-      <w:proofErr w:type="spellEnd"/>
-      <w:r>
-        <w:rPr>
-          <w:color w:val="FF0000"/>
-        </w:rPr>
-        <w:t xml:space="preserve"> approach helps children feel comfortable and relaxed during eye examinations.</w:t>
+        <w:t>centred approach helps children feel comfortable and relaxed during eye examinations.</w:t>
       </w:r>
     </w:p>
     <w:p>
@@ -8100,26 +8085,6 @@
 </file>
 
 <file path=customXml/item1.xml><?xml version="1.0" encoding="utf-8"?>
-<p:properties xmlns:p="http://schemas.microsoft.com/office/2006/metadata/properties" xmlns:xsi="http://www.w3.org/2001/XMLSchema-instance" xmlns:pc="http://schemas.microsoft.com/office/infopath/2007/PartnerControls">
-  <documentManagement>
-    <TaxCatchAll xmlns="c64b295e-e158-430a-a9fe-95bbf17b9d7d" xsi:nil="true"/>
-    <lcf76f155ced4ddcb4097134ff3c332f xmlns="0f5e39c8-e5a1-4a0d-b53f-9134be983d19">
-      <Terms xmlns="http://schemas.microsoft.com/office/infopath/2007/PartnerControls"/>
-    </lcf76f155ced4ddcb4097134ff3c332f>
-  </documentManagement>
-</p:properties>
-</file>
-
-<file path=customXml/item2.xml><?xml version="1.0" encoding="utf-8"?>
-<?mso-contentType ?>
-<FormTemplates xmlns="http://schemas.microsoft.com/sharepoint/v3/contenttype/forms">
-  <Display>DocumentLibraryForm</Display>
-  <Edit>DocumentLibraryForm</Edit>
-  <New>DocumentLibraryForm</New>
-</FormTemplates>
-</file>
-
-<file path=customXml/item3.xml><?xml version="1.0" encoding="utf-8"?>
 <ct:contentTypeSchema xmlns:ct="http://schemas.microsoft.com/office/2006/metadata/contentType" xmlns:ma="http://schemas.microsoft.com/office/2006/metadata/properties/metaAttributes" ct:_="" ma:_="" ma:contentTypeName="Document" ma:contentTypeID="0x01010060D23BF17FCDC947B8E404D646247F8D" ma:contentTypeVersion="19" ma:contentTypeDescription="Create a new document." ma:contentTypeScope="" ma:versionID="956565ba73e342f7ff85743a54cdae39">
   <xsd:schema xmlns:xsd="http://www.w3.org/2001/XMLSchema" xmlns:xs="http://www.w3.org/2001/XMLSchema" xmlns:p="http://schemas.microsoft.com/office/2006/metadata/properties" xmlns:ns2="0f5e39c8-e5a1-4a0d-b53f-9134be983d19" xmlns:ns3="c64b295e-e158-430a-a9fe-95bbf17b9d7d" targetNamespace="http://schemas.microsoft.com/office/2006/metadata/properties" ma:root="true" ma:fieldsID="e69c52ee8cc74cf3ee061ba3b646cca7" ns2:_="" ns3:_="">
     <xsd:import namespace="0f5e39c8-e5a1-4a0d-b53f-9134be983d19"/>
@@ -8380,26 +8345,27 @@
 </ct:contentTypeSchema>
 </file>
 
-<file path=customXml/itemProps1.xml><?xml version="1.0" encoding="utf-8"?>
-<ds:datastoreItem xmlns:ds="http://schemas.openxmlformats.org/officeDocument/2006/customXml" ds:itemID="{7D37F9A6-AE81-4AAE-AA1D-826F50362124}">
-  <ds:schemaRefs>
-    <ds:schemaRef ds:uri="http://schemas.microsoft.com/office/2006/metadata/properties"/>
-    <ds:schemaRef ds:uri="http://schemas.microsoft.com/office/infopath/2007/PartnerControls"/>
-    <ds:schemaRef ds:uri="c64b295e-e158-430a-a9fe-95bbf17b9d7d"/>
-    <ds:schemaRef ds:uri="0f5e39c8-e5a1-4a0d-b53f-9134be983d19"/>
-  </ds:schemaRefs>
-</ds:datastoreItem>
+<file path=customXml/item2.xml><?xml version="1.0" encoding="utf-8"?>
+<?mso-contentType ?>
+<FormTemplates xmlns="http://schemas.microsoft.com/sharepoint/v3/contenttype/forms">
+  <Display>DocumentLibraryForm</Display>
+  <Edit>DocumentLibraryForm</Edit>
+  <New>DocumentLibraryForm</New>
+</FormTemplates>
 </file>
 
-<file path=customXml/itemProps2.xml><?xml version="1.0" encoding="utf-8"?>
-<ds:datastoreItem xmlns:ds="http://schemas.openxmlformats.org/officeDocument/2006/customXml" ds:itemID="{403408A1-AF93-4ABE-804D-9E9CBAEE8CB6}">
-  <ds:schemaRefs>
-    <ds:schemaRef ds:uri="http://schemas.microsoft.com/sharepoint/v3/contenttype/forms"/>
-  </ds:schemaRefs>
-</ds:datastoreItem>
+<file path=customXml/item3.xml><?xml version="1.0" encoding="utf-8"?>
+<p:properties xmlns:p="http://schemas.microsoft.com/office/2006/metadata/properties" xmlns:xsi="http://www.w3.org/2001/XMLSchema-instance" xmlns:pc="http://schemas.microsoft.com/office/infopath/2007/PartnerControls">
+  <documentManagement>
+    <TaxCatchAll xmlns="c64b295e-e158-430a-a9fe-95bbf17b9d7d" xsi:nil="true"/>
+    <lcf76f155ced4ddcb4097134ff3c332f xmlns="0f5e39c8-e5a1-4a0d-b53f-9134be983d19">
+      <Terms xmlns="http://schemas.microsoft.com/office/infopath/2007/PartnerControls"/>
+    </lcf76f155ced4ddcb4097134ff3c332f>
+  </documentManagement>
+</p:properties>
 </file>
 
-<file path=customXml/itemProps3.xml><?xml version="1.0" encoding="utf-8"?>
+<file path=customXml/itemProps1.xml><?xml version="1.0" encoding="utf-8"?>
 <ds:datastoreItem xmlns:ds="http://schemas.openxmlformats.org/officeDocument/2006/customXml" ds:itemID="{71371D57-047C-423F-8732-F5AB20E58047}">
   <ds:schemaRefs>
     <ds:schemaRef ds:uri="http://schemas.microsoft.com/office/2006/metadata/contentType"/>
@@ -8416,4 +8382,23 @@
     <ds:schemaRef ds:uri="http://schemas.microsoft.com/internal/obd"/>
   </ds:schemaRefs>
 </ds:datastoreItem>
+</file>
+
+<file path=customXml/itemProps2.xml><?xml version="1.0" encoding="utf-8"?>
+<ds:datastoreItem xmlns:ds="http://schemas.openxmlformats.org/officeDocument/2006/customXml" ds:itemID="{403408A1-AF93-4ABE-804D-9E9CBAEE8CB6}">
+  <ds:schemaRefs>
+    <ds:schemaRef ds:uri="http://schemas.microsoft.com/sharepoint/v3/contenttype/forms"/>
+  </ds:schemaRefs>
+</ds:datastoreItem>
+</file>
+
+<file path=customXml/itemProps3.xml><?xml version="1.0" encoding="utf-8"?>
+<ds:datastoreItem xmlns:ds="http://schemas.openxmlformats.org/officeDocument/2006/customXml" ds:itemID="{7D37F9A6-AE81-4AAE-AA1D-826F50362124}">
+  <ds:schemaRefs>
+    <ds:schemaRef ds:uri="http://schemas.microsoft.com/office/2006/metadata/properties"/>
+    <ds:schemaRef ds:uri="http://schemas.microsoft.com/office/infopath/2007/PartnerControls"/>
+    <ds:schemaRef ds:uri="c64b295e-e158-430a-a9fe-95bbf17b9d7d"/>
+    <ds:schemaRef ds:uri="0f5e39c8-e5a1-4a0d-b53f-9134be983d19"/>
+  </ds:schemaRefs>
+</ds:datastoreItem>
 </file>
</xml_diff>